<commit_message>
Move role-based training tracker to Tool 28
</commit_message>
<xml_diff>
--- a/downloads/AI_Playbook_and_Toolkit_Website_Complete_Reference.docx
+++ b/downloads/AI_Playbook_and_Toolkit_Website_Complete_Reference.docx
@@ -13290,7 +13290,7 @@
           <w:rFonts w:ascii="Arial" w:hAnsi="Arial"/>
           <w:sz w:val="21"/>
         </w:rPr>
-        <w:t>Related plays: 2, 3, 7, 11, 13. Related tools: 7, 13, 14, 40, 43, 46.</w:t>
+        <w:t>Related plays: 2, 3, 7, 11, 13. Related tools: 7, 13, 14, 41, 44, 47.</w:t>
       </w:r>
     </w:p>
     <w:p>
@@ -13425,7 +13425,7 @@
           <w:rFonts w:ascii="Arial" w:hAnsi="Arial"/>
           <w:sz w:val="21"/>
         </w:rPr>
-        <w:t>Related plays: 1, 3, 7, 8, 13. Related tools: 2, 4, 31, 47.</w:t>
+        <w:t>Related plays: 1, 3, 7, 8, 13. Related tools: 2, 4, 32, 48.</w:t>
       </w:r>
     </w:p>
     <w:p>
@@ -13560,7 +13560,7 @@
           <w:rFonts w:ascii="Arial" w:hAnsi="Arial"/>
           <w:sz w:val="21"/>
         </w:rPr>
-        <w:t>Related plays: 1, 3, 4, 10, 12. Related tools: 19, 20, 28, 45.</w:t>
+        <w:t>Related plays: 1, 3, 4, 10, 12. Related tools: 19, 20, 29, 46.</w:t>
       </w:r>
     </w:p>
     <w:p>
@@ -13707,7 +13707,7 @@
           <w:rFonts w:ascii="Arial" w:hAnsi="Arial"/>
           <w:sz w:val="21"/>
         </w:rPr>
-        <w:t>Related plays: 1, 2, 3, 7, 12. Related tools: 1, 6, 7, 13, 45.</w:t>
+        <w:t>Related plays: 1, 2, 3, 7, 12. Related tools: 1, 6, 7, 13, 46.</w:t>
       </w:r>
     </w:p>
     <w:p>
@@ -13842,7 +13842,7 @@
           <w:rFonts w:ascii="Arial" w:hAnsi="Arial"/>
           <w:sz w:val="21"/>
         </w:rPr>
-        <w:t>Related plays: 8, 9. Related tools: 35, 31, 32.</w:t>
+        <w:t>Related plays: 8, 9. Related tools: 36, 32, 33.</w:t>
       </w:r>
     </w:p>
     <w:p>
@@ -13989,7 +13989,7 @@
           <w:rFonts w:ascii="Arial" w:hAnsi="Arial"/>
           <w:sz w:val="21"/>
         </w:rPr>
-        <w:t>Related plays: 3, 6, 10, 11, 12. Related tools: 12, 13, 17, 23, 29, 35.</w:t>
+        <w:t>Related plays: 3, 6, 10, 11, 12. Related tools: 12, 13, 17, 23, 30, 36.</w:t>
       </w:r>
     </w:p>
     <w:p>
@@ -14124,7 +14124,7 @@
           <w:rFonts w:ascii="Arial" w:hAnsi="Arial"/>
           <w:sz w:val="21"/>
         </w:rPr>
-        <w:t>Related plays: 4, 7, 13. Related tools: 3, 20, 22, 46.</w:t>
+        <w:t>Related plays: 4, 7, 13. Related tools: 3, 20, 22, 47.</w:t>
       </w:r>
     </w:p>
     <w:p>
@@ -14259,7 +14259,7 @@
           <w:rFonts w:ascii="Arial" w:hAnsi="Arial"/>
           <w:sz w:val="21"/>
         </w:rPr>
-        <w:t>Related plays: 1, 4, 7, 10, 13. Related tools: 3, 19, 20, 22, 46.</w:t>
+        <w:t>Related plays: 1, 4, 7, 10, 13. Related tools: 3, 19, 20, 22, 47.</w:t>
       </w:r>
     </w:p>
     <w:p>
@@ -14406,7 +14406,7 @@
           <w:rFonts w:ascii="Arial" w:hAnsi="Arial"/>
           <w:sz w:val="21"/>
         </w:rPr>
-        <w:t>Related plays: 2, 3, 11, 12. Related tools: 10, 15, 16, 33, 38.</w:t>
+        <w:t>Related plays: 2, 3, 11, 12. Related tools: 10, 15, 16, 34, 39.</w:t>
       </w:r>
     </w:p>
     <w:p>
@@ -14541,7 +14541,7 @@
           <w:rFonts w:ascii="Arial" w:hAnsi="Arial"/>
           <w:sz w:val="21"/>
         </w:rPr>
-        <w:t>Related plays: 3, 7, 8, 9, 12. Related tools: 4, 5, 31, 33, 44.</w:t>
+        <w:t>Related plays: 3, 7, 8, 9, 12. Related tools: 4, 5, 32, 34, 45.</w:t>
       </w:r>
     </w:p>
     <w:p>
@@ -14676,7 +14676,7 @@
           <w:rFonts w:ascii="Arial" w:hAnsi="Arial"/>
           <w:sz w:val="21"/>
         </w:rPr>
-        <w:t>Related plays: 5, 6, 10. Related tools: 23, 24, 25, 27, 48, 28, 29.</w:t>
+        <w:t>Related plays: 5, 6, 10. Related tools: 23, 24, 25, 27, 28, 29, 30.</w:t>
       </w:r>
     </w:p>
     <w:p>
@@ -14859,7 +14859,7 @@
           <w:rFonts w:ascii="Arial" w:hAnsi="Arial"/>
           <w:sz w:val="21"/>
         </w:rPr>
-        <w:t>Related plays: 2, 3, 7, 9, 10, 12, 13. Related tools: 7, 8, 9, 13, 23, 35, 40, 41, 43, 44, 46, 47.</w:t>
+        <w:t>Related plays: 2, 3, 7, 9, 10, 12, 13. Related tools: 7, 8, 9, 13, 23, 36, 41, 42, 44, 45, 47, 48.</w:t>
       </w:r>
     </w:p>
     <w:p>
@@ -15006,7 +15006,7 @@
           <w:rFonts w:ascii="Arial" w:hAnsi="Arial"/>
           <w:sz w:val="21"/>
         </w:rPr>
-        <w:t>Related plays: 12, 13. Related tools: 14, 17, 18, 40, 41, 43, 44, 45, 46, 47.</w:t>
+        <w:t>Related plays: 12, 13. Related tools: 14, 17, 18, 41, 42, 44, 45, 46, 47, 48.</w:t>
       </w:r>
     </w:p>
     <w:p>
@@ -15088,7 +15088,7 @@
           <w:rFonts w:ascii="Arial" w:hAnsi="Arial"/>
           <w:sz w:val="21"/>
         </w:rPr>
-        <w:t>Recommended plays: 1, 3, 12. Recommended tools: 1, 2, 12, 45, 17.</w:t>
+        <w:t>Recommended plays: 1, 3, 12. Recommended tools: 1, 2, 12, 46, 17.</w:t>
       </w:r>
     </w:p>
     <w:p>
@@ -15153,7 +15153,7 @@
           <w:rFonts w:ascii="Arial" w:hAnsi="Arial"/>
           <w:sz w:val="21"/>
         </w:rPr>
-        <w:t>Recommended plays: 2, 9, 11, 13. Recommended tools: 7, 9, 15, 38, 43.</w:t>
+        <w:t>Recommended plays: 2, 9, 11, 13. Recommended tools: 7, 9, 15, 39, 44.</w:t>
       </w:r>
     </w:p>
     <w:p>
@@ -15218,7 +15218,7 @@
           <w:rFonts w:ascii="Arial" w:hAnsi="Arial"/>
           <w:sz w:val="21"/>
         </w:rPr>
-        <w:t>Recommended plays: 5, 6, 10. Recommended tools: 23, 24, 26, 48, 28, 29.</w:t>
+        <w:t>Recommended plays: 5, 6, 10. Recommended tools: 23, 24, 26, 28, 29, 30.</w:t>
       </w:r>
     </w:p>
     <w:p>
@@ -15283,7 +15283,7 @@
           <w:rFonts w:ascii="Arial" w:hAnsi="Arial"/>
           <w:sz w:val="21"/>
         </w:rPr>
-        <w:t>Recommended plays: 4, 7, 13. Recommended tools: 3, 20, 21, 46.</w:t>
+        <w:t>Recommended plays: 4, 7, 13. Recommended tools: 3, 20, 21, 47.</w:t>
       </w:r>
     </w:p>
     <w:p>
@@ -15348,7 +15348,7 @@
           <w:rFonts w:ascii="Arial" w:hAnsi="Arial"/>
           <w:sz w:val="21"/>
         </w:rPr>
-        <w:t>Recommended plays: 4, 7, 8. Recommended tools: 20, 21, 31, 32.</w:t>
+        <w:t>Recommended plays: 4, 7, 8. Recommended tools: 20, 21, 32, 33.</w:t>
       </w:r>
     </w:p>
     <w:p>
@@ -15478,7 +15478,7 @@
           <w:rFonts w:ascii="Arial" w:hAnsi="Arial"/>
           <w:sz w:val="21"/>
         </w:rPr>
-        <w:t>Recommended plays: 1, 3, 7, 8, 11, 12. Recommended tools: 4, 5, 6, 19, 31, 33.</w:t>
+        <w:t>Recommended plays: 1, 3, 7, 8, 11, 12. Recommended tools: 4, 5, 6, 19, 32, 34.</w:t>
       </w:r>
     </w:p>
     <w:p>
@@ -27825,7 +27825,362 @@
         <w:pStyle w:val="Heading2"/>
       </w:pPr>
       <w:r>
-        <w:t>Tool 28: Staff Communication &amp; FAQ Template</w:t>
+        <w:t>Tool 28: Role-Based Training Plan and Completion Tracker</w:t>
+      </w:r>
+    </w:p>
+    <w:p>
+      <w:r>
+        <w:rPr>
+          <w:rFonts w:ascii="Arial" w:hAnsi="Arial"/>
+          <w:sz w:val="21"/>
+        </w:rPr>
+        <w:t>Assign learning modules by role, set completion standards, track deadlines, verify completion, and identify follow-up support needs.</w:t>
+      </w:r>
+    </w:p>
+    <w:p>
+      <w:r>
+        <w:rPr>
+          <w:rFonts w:ascii="Arial" w:hAnsi="Arial"/>
+          <w:sz w:val="21"/>
+        </w:rPr>
+        <w:t>Type: Tracker. Topic: Workforce. Maturity: Readiness.</w:t>
+      </w:r>
+    </w:p>
+    <w:p>
+      <w:r>
+        <w:rPr>
+          <w:rFonts w:ascii="Arial" w:hAnsi="Arial"/>
+          <w:sz w:val="21"/>
+        </w:rPr>
+        <w:t>Supporting plays: 5, 10. Roles: Training, Supervisors, Organization administrators, AI champions.</w:t>
+      </w:r>
+    </w:p>
+    <w:p>
+      <w:pPr>
+        <w:pStyle w:val="Heading3"/>
+      </w:pPr>
+      <w:r>
+        <w:t>Training plan profile</w:t>
+      </w:r>
+    </w:p>
+    <w:p>
+      <w:pPr>
+        <w:pStyle w:val="ListBullet"/>
+      </w:pPr>
+      <w:r>
+        <w:rPr>
+          <w:rFonts w:ascii="Arial" w:hAnsi="Arial"/>
+          <w:sz w:val="19"/>
+        </w:rPr>
+        <w:t>Training plan name</w:t>
+      </w:r>
+    </w:p>
+    <w:p>
+      <w:pPr>
+        <w:pStyle w:val="ListBullet"/>
+      </w:pPr>
+      <w:r>
+        <w:rPr>
+          <w:rFonts w:ascii="Arial" w:hAnsi="Arial"/>
+          <w:sz w:val="19"/>
+        </w:rPr>
+        <w:t>Training period</w:t>
+      </w:r>
+    </w:p>
+    <w:p>
+      <w:pPr>
+        <w:pStyle w:val="ListBullet"/>
+      </w:pPr>
+      <w:r>
+        <w:rPr>
+          <w:rFonts w:ascii="Arial" w:hAnsi="Arial"/>
+          <w:sz w:val="19"/>
+        </w:rPr>
+        <w:t>Training owner</w:t>
+      </w:r>
+    </w:p>
+    <w:p>
+      <w:pPr>
+        <w:pStyle w:val="ListBullet"/>
+      </w:pPr>
+      <w:r>
+        <w:rPr>
+          <w:rFonts w:ascii="Arial" w:hAnsi="Arial"/>
+          <w:sz w:val="19"/>
+        </w:rPr>
+        <w:t>Organization administrator</w:t>
+      </w:r>
+    </w:p>
+    <w:p>
+      <w:pPr>
+        <w:pStyle w:val="ListBullet"/>
+      </w:pPr>
+      <w:r>
+        <w:rPr>
+          <w:rFonts w:ascii="Arial" w:hAnsi="Arial"/>
+          <w:sz w:val="19"/>
+        </w:rPr>
+        <w:t>Related play or deployment</w:t>
+      </w:r>
+    </w:p>
+    <w:p>
+      <w:pPr>
+        <w:pStyle w:val="ListBullet"/>
+      </w:pPr>
+      <w:r>
+        <w:rPr>
+          <w:rFonts w:ascii="Arial" w:hAnsi="Arial"/>
+          <w:sz w:val="19"/>
+        </w:rPr>
+        <w:t>Last updated</w:t>
+      </w:r>
+    </w:p>
+    <w:p>
+      <w:pPr>
+        <w:pStyle w:val="Heading3"/>
+      </w:pPr>
+      <w:r>
+        <w:t>Role-based module assignments</w:t>
+      </w:r>
+    </w:p>
+    <w:p>
+      <w:pPr>
+        <w:pStyle w:val="ListBullet"/>
+      </w:pPr>
+      <w:r>
+        <w:rPr>
+          <w:rFonts w:ascii="Arial" w:hAnsi="Arial"/>
+          <w:sz w:val="19"/>
+        </w:rPr>
+        <w:t>Executive leadership required modules</w:t>
+      </w:r>
+    </w:p>
+    <w:p>
+      <w:pPr>
+        <w:pStyle w:val="ListBullet"/>
+      </w:pPr>
+      <w:r>
+        <w:rPr>
+          <w:rFonts w:ascii="Arial" w:hAnsi="Arial"/>
+          <w:sz w:val="19"/>
+        </w:rPr>
+        <w:t>Governance committee required modules</w:t>
+      </w:r>
+    </w:p>
+    <w:p>
+      <w:pPr>
+        <w:pStyle w:val="ListBullet"/>
+      </w:pPr>
+      <w:r>
+        <w:rPr>
+          <w:rFonts w:ascii="Arial" w:hAnsi="Arial"/>
+          <w:sz w:val="19"/>
+        </w:rPr>
+        <w:t>Program staff required modules</w:t>
+      </w:r>
+    </w:p>
+    <w:p>
+      <w:pPr>
+        <w:pStyle w:val="ListBullet"/>
+      </w:pPr>
+      <w:r>
+        <w:rPr>
+          <w:rFonts w:ascii="Arial" w:hAnsi="Arial"/>
+          <w:sz w:val="19"/>
+        </w:rPr>
+        <w:t>Data/analytics staff required modules</w:t>
+      </w:r>
+    </w:p>
+    <w:p>
+      <w:pPr>
+        <w:pStyle w:val="ListBullet"/>
+      </w:pPr>
+      <w:r>
+        <w:rPr>
+          <w:rFonts w:ascii="Arial" w:hAnsi="Arial"/>
+          <w:sz w:val="19"/>
+        </w:rPr>
+        <w:t>IT/security staff required modules</w:t>
+      </w:r>
+    </w:p>
+    <w:p>
+      <w:pPr>
+        <w:pStyle w:val="ListBullet"/>
+      </w:pPr>
+      <w:r>
+        <w:rPr>
+          <w:rFonts w:ascii="Arial" w:hAnsi="Arial"/>
+          <w:sz w:val="19"/>
+        </w:rPr>
+        <w:t>Legal/privacy/procurement required modules</w:t>
+      </w:r>
+    </w:p>
+    <w:p>
+      <w:pPr>
+        <w:pStyle w:val="ListBullet"/>
+      </w:pPr>
+      <w:r>
+        <w:rPr>
+          <w:rFonts w:ascii="Arial" w:hAnsi="Arial"/>
+          <w:sz w:val="19"/>
+        </w:rPr>
+        <w:t>Communications/equity/community engagement required modules</w:t>
+      </w:r>
+    </w:p>
+    <w:p>
+      <w:pPr>
+        <w:pStyle w:val="Heading3"/>
+      </w:pPr>
+      <w:r>
+        <w:t>Completion tracking</w:t>
+      </w:r>
+    </w:p>
+    <w:p>
+      <w:pPr>
+        <w:pStyle w:val="ListBullet"/>
+      </w:pPr>
+      <w:r>
+        <w:rPr>
+          <w:rFonts w:ascii="Arial" w:hAnsi="Arial"/>
+          <w:sz w:val="19"/>
+        </w:rPr>
+        <w:t>Role or staff group</w:t>
+      </w:r>
+    </w:p>
+    <w:p>
+      <w:pPr>
+        <w:pStyle w:val="ListBullet"/>
+      </w:pPr>
+      <w:r>
+        <w:rPr>
+          <w:rFonts w:ascii="Arial" w:hAnsi="Arial"/>
+          <w:sz w:val="19"/>
+        </w:rPr>
+        <w:t>Required completion date</w:t>
+      </w:r>
+    </w:p>
+    <w:p>
+      <w:pPr>
+        <w:pStyle w:val="ListBullet"/>
+      </w:pPr>
+      <w:r>
+        <w:rPr>
+          <w:rFonts w:ascii="Arial" w:hAnsi="Arial"/>
+          <w:sz w:val="19"/>
+        </w:rPr>
+        <w:t>Completion standard</w:t>
+      </w:r>
+    </w:p>
+    <w:p>
+      <w:pPr>
+        <w:pStyle w:val="ListBullet"/>
+      </w:pPr>
+      <w:r>
+        <w:rPr>
+          <w:rFonts w:ascii="Arial" w:hAnsi="Arial"/>
+          <w:sz w:val="19"/>
+        </w:rPr>
+        <w:t>Completion status</w:t>
+      </w:r>
+    </w:p>
+    <w:p>
+      <w:pPr>
+        <w:pStyle w:val="ListBullet"/>
+      </w:pPr>
+      <w:r>
+        <w:rPr>
+          <w:rFonts w:ascii="Arial" w:hAnsi="Arial"/>
+          <w:sz w:val="19"/>
+        </w:rPr>
+        <w:t>Supervisor or administrator verification</w:t>
+      </w:r>
+    </w:p>
+    <w:p>
+      <w:pPr>
+        <w:pStyle w:val="ListBullet"/>
+      </w:pPr>
+      <w:r>
+        <w:rPr>
+          <w:rFonts w:ascii="Arial" w:hAnsi="Arial"/>
+          <w:sz w:val="19"/>
+        </w:rPr>
+        <w:t>Evidence or notes</w:t>
+      </w:r>
+    </w:p>
+    <w:p>
+      <w:pPr>
+        <w:pStyle w:val="Heading3"/>
+      </w:pPr>
+      <w:r>
+        <w:t>Follow-up and support</w:t>
+      </w:r>
+    </w:p>
+    <w:p>
+      <w:pPr>
+        <w:pStyle w:val="ListBullet"/>
+      </w:pPr>
+      <w:r>
+        <w:rPr>
+          <w:rFonts w:ascii="Arial" w:hAnsi="Arial"/>
+          <w:sz w:val="19"/>
+        </w:rPr>
+        <w:t>Staff groups needing additional support</w:t>
+      </w:r>
+    </w:p>
+    <w:p>
+      <w:pPr>
+        <w:pStyle w:val="ListBullet"/>
+      </w:pPr>
+      <w:r>
+        <w:rPr>
+          <w:rFonts w:ascii="Arial" w:hAnsi="Arial"/>
+          <w:sz w:val="19"/>
+        </w:rPr>
+        <w:t>Office hours or coaching schedule</w:t>
+      </w:r>
+    </w:p>
+    <w:p>
+      <w:pPr>
+        <w:pStyle w:val="ListBullet"/>
+      </w:pPr>
+      <w:r>
+        <w:rPr>
+          <w:rFonts w:ascii="Arial" w:hAnsi="Arial"/>
+          <w:sz w:val="19"/>
+        </w:rPr>
+        <w:t>Champion or mentor assigned</w:t>
+      </w:r>
+    </w:p>
+    <w:p>
+      <w:pPr>
+        <w:pStyle w:val="ListBullet"/>
+      </w:pPr>
+      <w:r>
+        <w:rPr>
+          <w:rFonts w:ascii="Arial" w:hAnsi="Arial"/>
+          <w:sz w:val="19"/>
+        </w:rPr>
+        <w:t>Refresher training needs</w:t>
+      </w:r>
+    </w:p>
+    <w:p>
+      <w:pPr>
+        <w:pStyle w:val="ListBullet"/>
+      </w:pPr>
+      <w:r>
+        <w:rPr>
+          <w:rFonts w:ascii="Arial" w:hAnsi="Arial"/>
+          <w:sz w:val="19"/>
+        </w:rPr>
+        <w:t>Escalation or governance issues</w:t>
+      </w:r>
+    </w:p>
+    <w:p>
+      <w:pPr>
+        <w:pStyle w:val="Heading2"/>
+      </w:pPr>
+      <w:r>
+        <w:t>Tool 29: Staff Communication &amp; FAQ Template</w:t>
       </w:r>
     </w:p>
     <w:p>
@@ -28040,7 +28395,7 @@
         <w:pStyle w:val="Heading2"/>
       </w:pPr>
       <w:r>
-        <w:t>Tool 29: Resistance &amp; Barrier Identification</w:t>
+        <w:t>Tool 30: Resistance &amp; Barrier Identification</w:t>
       </w:r>
     </w:p>
     <w:p>
@@ -28267,7 +28622,7 @@
         <w:pStyle w:val="Heading2"/>
       </w:pPr>
       <w:r>
-        <w:t>Tool 30: Use Case Scoring &amp; Prioritization Matrix</w:t>
+        <w:t>Tool 31: Use Case Scoring &amp; Prioritization Matrix</w:t>
       </w:r>
     </w:p>
     <w:p>
@@ -28506,7 +28861,7 @@
         <w:pStyle w:val="Heading2"/>
       </w:pPr>
       <w:r>
-        <w:t>Tool 31: Vendor Evaluation Checklist</w:t>
+        <w:t>Tool 32: Vendor Evaluation Checklist</w:t>
       </w:r>
     </w:p>
     <w:p>
@@ -28745,7 +29100,7 @@
         <w:pStyle w:val="Heading2"/>
       </w:pPr>
       <w:r>
-        <w:t>Tool 32: Funding Strategy Checklists</w:t>
+        <w:t>Tool 33: Funding Strategy Checklists</w:t>
       </w:r>
     </w:p>
     <w:p>
@@ -28972,7 +29327,7 @@
         <w:pStyle w:val="Heading2"/>
       </w:pPr>
       <w:r>
-        <w:t>Tool 33: STLT AI Procurement and Vendor Addendum</w:t>
+        <w:t>Tool 34: STLT AI Procurement and Vendor Addendum</w:t>
       </w:r>
     </w:p>
     <w:p>
@@ -29223,7 +29578,7 @@
         <w:pStyle w:val="Heading2"/>
       </w:pPr>
       <w:r>
-        <w:t>Tool 34: AI Total Cost of Ownership and Sustainability Worksheet</w:t>
+        <w:t>Tool 35: AI Total Cost of Ownership and Sustainability Worksheet</w:t>
       </w:r>
     </w:p>
     <w:p>
@@ -29474,7 +29829,7 @@
         <w:pStyle w:val="Heading2"/>
       </w:pPr>
       <w:r>
-        <w:t>Tool 35: AI Implementation Timeline</w:t>
+        <w:t>Tool 36: AI Implementation Timeline</w:t>
       </w:r>
     </w:p>
     <w:p>
@@ -29701,7 +30056,7 @@
         <w:pStyle w:val="Heading2"/>
       </w:pPr>
       <w:r>
-        <w:t>Tool 36: Roadmap Dependency and Risk Register</w:t>
+        <w:t>Tool 37: Roadmap Dependency and Risk Register</w:t>
       </w:r>
     </w:p>
     <w:p>
@@ -29952,7 +30307,7 @@
         <w:pStyle w:val="Heading2"/>
       </w:pPr>
       <w:r>
-        <w:t>Tool 37: Change Management Execution Dashboard</w:t>
+        <w:t>Tool 38: Change Management Execution Dashboard</w:t>
       </w:r>
     </w:p>
     <w:p>
@@ -30203,7 +30558,7 @@
         <w:pStyle w:val="Heading2"/>
       </w:pPr>
       <w:r>
-        <w:t>Tool 38: Technical Infrastructure Readiness Checklist</w:t>
+        <w:t>Tool 39: Technical Infrastructure Readiness Checklist</w:t>
       </w:r>
     </w:p>
     <w:p>
@@ -30406,7 +30761,7 @@
         <w:pStyle w:val="Heading2"/>
       </w:pPr>
       <w:r>
-        <w:t>Tool 39: AI Model Testing &amp; Validation Protocol</w:t>
+        <w:t>Tool 40: AI Model Testing &amp; Validation Protocol</w:t>
       </w:r>
     </w:p>
     <w:p>
@@ -30645,7 +31000,7 @@
         <w:pStyle w:val="Heading2"/>
       </w:pPr>
       <w:r>
-        <w:t>Tool 40: AI Pilot Evaluation Dashboard</w:t>
+        <w:t>Tool 41: AI Pilot Evaluation Dashboard</w:t>
       </w:r>
     </w:p>
     <w:p>
@@ -30864,7 +31219,7 @@
           <w:rFonts w:ascii="Arial" w:hAnsi="Arial"/>
           <w:sz w:val="19"/>
         </w:rPr>
-        <w:t>Recommendation for Tool 41</w:t>
+        <w:t>Recommendation for Tool 42</w:t>
       </w:r>
     </w:p>
     <w:p>
@@ -30872,7 +31227,7 @@
         <w:pStyle w:val="Heading2"/>
       </w:pPr>
       <w:r>
-        <w:t>Tool 41: Pilot-to-Scale Decision Framework</w:t>
+        <w:t>Tool 42: Pilot-to-Scale Decision Framework</w:t>
       </w:r>
     </w:p>
     <w:p>
@@ -31075,7 +31430,7 @@
         <w:pStyle w:val="Heading2"/>
       </w:pPr>
       <w:r>
-        <w:t>Tool 42: AI Deployment Readiness and Go-Live Checklist</w:t>
+        <w:t>Tool 43: AI Deployment Readiness and Go-Live Checklist</w:t>
       </w:r>
     </w:p>
     <w:p>
@@ -31350,7 +31705,7 @@
         <w:pStyle w:val="Heading2"/>
       </w:pPr>
       <w:r>
-        <w:t>Tool 43: Performance Monitoring Dashboard</w:t>
+        <w:t>Tool 44: Performance Monitoring Dashboard</w:t>
       </w:r>
     </w:p>
     <w:p>
@@ -31577,7 +31932,7 @@
         <w:pStyle w:val="Heading2"/>
       </w:pPr>
       <w:r>
-        <w:t>Tool 44: Continuous Improvement Log</w:t>
+        <w:t>Tool 45: Continuous Improvement Log</w:t>
       </w:r>
     </w:p>
     <w:p>
@@ -31816,7 +32171,7 @@
         <w:pStyle w:val="Heading2"/>
       </w:pPr>
       <w:r>
-        <w:t>Tool 45: AI Governance Review Meeting Template</w:t>
+        <w:t>Tool 46: AI Governance Review Meeting Template</w:t>
       </w:r>
     </w:p>
     <w:p>
@@ -32055,7 +32410,7 @@
         <w:pStyle w:val="Heading2"/>
       </w:pPr>
       <w:r>
-        <w:t>Tool 46: Equity &amp; Disparity Impact Monitoring</w:t>
+        <w:t>Tool 47: Equity &amp; Disparity Impact Monitoring</w:t>
       </w:r>
     </w:p>
     <w:p>
@@ -32270,7 +32625,7 @@
         <w:pStyle w:val="Heading2"/>
       </w:pPr>
       <w:r>
-        <w:t>Tool 47: AI Evaluation &amp; Outcomes Reporting</w:t>
+        <w:t>Tool 48: AI Evaluation &amp; Outcomes Reporting</w:t>
       </w:r>
     </w:p>
     <w:p>
@@ -32466,361 +32821,6 @@
           <w:sz w:val="19"/>
         </w:rPr>
         <w:t>Next reporting period actions</w:t>
-      </w:r>
-    </w:p>
-    <w:p>
-      <w:pPr>
-        <w:pStyle w:val="Heading2"/>
-      </w:pPr>
-      <w:r>
-        <w:t>Tool 48: Role-Based Training Plan and Completion Tracker</w:t>
-      </w:r>
-    </w:p>
-    <w:p>
-      <w:r>
-        <w:rPr>
-          <w:rFonts w:ascii="Arial" w:hAnsi="Arial"/>
-          <w:sz w:val="21"/>
-        </w:rPr>
-        <w:t>Assign learning modules by role, set completion standards, track deadlines, verify completion, and identify follow-up support needs.</w:t>
-      </w:r>
-    </w:p>
-    <w:p>
-      <w:r>
-        <w:rPr>
-          <w:rFonts w:ascii="Arial" w:hAnsi="Arial"/>
-          <w:sz w:val="21"/>
-        </w:rPr>
-        <w:t>Type: Tracker. Topic: Workforce. Maturity: Readiness.</w:t>
-      </w:r>
-    </w:p>
-    <w:p>
-      <w:r>
-        <w:rPr>
-          <w:rFonts w:ascii="Arial" w:hAnsi="Arial"/>
-          <w:sz w:val="21"/>
-        </w:rPr>
-        <w:t>Supporting plays: 5, 10. Roles: Training, Supervisors, Organization administrators, AI champions.</w:t>
-      </w:r>
-    </w:p>
-    <w:p>
-      <w:pPr>
-        <w:pStyle w:val="Heading3"/>
-      </w:pPr>
-      <w:r>
-        <w:t>Training plan profile</w:t>
-      </w:r>
-    </w:p>
-    <w:p>
-      <w:pPr>
-        <w:pStyle w:val="ListBullet"/>
-      </w:pPr>
-      <w:r>
-        <w:rPr>
-          <w:rFonts w:ascii="Arial" w:hAnsi="Arial"/>
-          <w:sz w:val="19"/>
-        </w:rPr>
-        <w:t>Training plan name</w:t>
-      </w:r>
-    </w:p>
-    <w:p>
-      <w:pPr>
-        <w:pStyle w:val="ListBullet"/>
-      </w:pPr>
-      <w:r>
-        <w:rPr>
-          <w:rFonts w:ascii="Arial" w:hAnsi="Arial"/>
-          <w:sz w:val="19"/>
-        </w:rPr>
-        <w:t>Training period</w:t>
-      </w:r>
-    </w:p>
-    <w:p>
-      <w:pPr>
-        <w:pStyle w:val="ListBullet"/>
-      </w:pPr>
-      <w:r>
-        <w:rPr>
-          <w:rFonts w:ascii="Arial" w:hAnsi="Arial"/>
-          <w:sz w:val="19"/>
-        </w:rPr>
-        <w:t>Training owner</w:t>
-      </w:r>
-    </w:p>
-    <w:p>
-      <w:pPr>
-        <w:pStyle w:val="ListBullet"/>
-      </w:pPr>
-      <w:r>
-        <w:rPr>
-          <w:rFonts w:ascii="Arial" w:hAnsi="Arial"/>
-          <w:sz w:val="19"/>
-        </w:rPr>
-        <w:t>Organization administrator</w:t>
-      </w:r>
-    </w:p>
-    <w:p>
-      <w:pPr>
-        <w:pStyle w:val="ListBullet"/>
-      </w:pPr>
-      <w:r>
-        <w:rPr>
-          <w:rFonts w:ascii="Arial" w:hAnsi="Arial"/>
-          <w:sz w:val="19"/>
-        </w:rPr>
-        <w:t>Related play or deployment</w:t>
-      </w:r>
-    </w:p>
-    <w:p>
-      <w:pPr>
-        <w:pStyle w:val="ListBullet"/>
-      </w:pPr>
-      <w:r>
-        <w:rPr>
-          <w:rFonts w:ascii="Arial" w:hAnsi="Arial"/>
-          <w:sz w:val="19"/>
-        </w:rPr>
-        <w:t>Last updated</w:t>
-      </w:r>
-    </w:p>
-    <w:p>
-      <w:pPr>
-        <w:pStyle w:val="Heading3"/>
-      </w:pPr>
-      <w:r>
-        <w:t>Role-based module assignments</w:t>
-      </w:r>
-    </w:p>
-    <w:p>
-      <w:pPr>
-        <w:pStyle w:val="ListBullet"/>
-      </w:pPr>
-      <w:r>
-        <w:rPr>
-          <w:rFonts w:ascii="Arial" w:hAnsi="Arial"/>
-          <w:sz w:val="19"/>
-        </w:rPr>
-        <w:t>Executive leadership required modules</w:t>
-      </w:r>
-    </w:p>
-    <w:p>
-      <w:pPr>
-        <w:pStyle w:val="ListBullet"/>
-      </w:pPr>
-      <w:r>
-        <w:rPr>
-          <w:rFonts w:ascii="Arial" w:hAnsi="Arial"/>
-          <w:sz w:val="19"/>
-        </w:rPr>
-        <w:t>Governance committee required modules</w:t>
-      </w:r>
-    </w:p>
-    <w:p>
-      <w:pPr>
-        <w:pStyle w:val="ListBullet"/>
-      </w:pPr>
-      <w:r>
-        <w:rPr>
-          <w:rFonts w:ascii="Arial" w:hAnsi="Arial"/>
-          <w:sz w:val="19"/>
-        </w:rPr>
-        <w:t>Program staff required modules</w:t>
-      </w:r>
-    </w:p>
-    <w:p>
-      <w:pPr>
-        <w:pStyle w:val="ListBullet"/>
-      </w:pPr>
-      <w:r>
-        <w:rPr>
-          <w:rFonts w:ascii="Arial" w:hAnsi="Arial"/>
-          <w:sz w:val="19"/>
-        </w:rPr>
-        <w:t>Data/analytics staff required modules</w:t>
-      </w:r>
-    </w:p>
-    <w:p>
-      <w:pPr>
-        <w:pStyle w:val="ListBullet"/>
-      </w:pPr>
-      <w:r>
-        <w:rPr>
-          <w:rFonts w:ascii="Arial" w:hAnsi="Arial"/>
-          <w:sz w:val="19"/>
-        </w:rPr>
-        <w:t>IT/security staff required modules</w:t>
-      </w:r>
-    </w:p>
-    <w:p>
-      <w:pPr>
-        <w:pStyle w:val="ListBullet"/>
-      </w:pPr>
-      <w:r>
-        <w:rPr>
-          <w:rFonts w:ascii="Arial" w:hAnsi="Arial"/>
-          <w:sz w:val="19"/>
-        </w:rPr>
-        <w:t>Legal/privacy/procurement required modules</w:t>
-      </w:r>
-    </w:p>
-    <w:p>
-      <w:pPr>
-        <w:pStyle w:val="ListBullet"/>
-      </w:pPr>
-      <w:r>
-        <w:rPr>
-          <w:rFonts w:ascii="Arial" w:hAnsi="Arial"/>
-          <w:sz w:val="19"/>
-        </w:rPr>
-        <w:t>Communications/equity/community engagement required modules</w:t>
-      </w:r>
-    </w:p>
-    <w:p>
-      <w:pPr>
-        <w:pStyle w:val="Heading3"/>
-      </w:pPr>
-      <w:r>
-        <w:t>Completion tracking</w:t>
-      </w:r>
-    </w:p>
-    <w:p>
-      <w:pPr>
-        <w:pStyle w:val="ListBullet"/>
-      </w:pPr>
-      <w:r>
-        <w:rPr>
-          <w:rFonts w:ascii="Arial" w:hAnsi="Arial"/>
-          <w:sz w:val="19"/>
-        </w:rPr>
-        <w:t>Role or staff group</w:t>
-      </w:r>
-    </w:p>
-    <w:p>
-      <w:pPr>
-        <w:pStyle w:val="ListBullet"/>
-      </w:pPr>
-      <w:r>
-        <w:rPr>
-          <w:rFonts w:ascii="Arial" w:hAnsi="Arial"/>
-          <w:sz w:val="19"/>
-        </w:rPr>
-        <w:t>Required completion date</w:t>
-      </w:r>
-    </w:p>
-    <w:p>
-      <w:pPr>
-        <w:pStyle w:val="ListBullet"/>
-      </w:pPr>
-      <w:r>
-        <w:rPr>
-          <w:rFonts w:ascii="Arial" w:hAnsi="Arial"/>
-          <w:sz w:val="19"/>
-        </w:rPr>
-        <w:t>Completion standard</w:t>
-      </w:r>
-    </w:p>
-    <w:p>
-      <w:pPr>
-        <w:pStyle w:val="ListBullet"/>
-      </w:pPr>
-      <w:r>
-        <w:rPr>
-          <w:rFonts w:ascii="Arial" w:hAnsi="Arial"/>
-          <w:sz w:val="19"/>
-        </w:rPr>
-        <w:t>Completion status</w:t>
-      </w:r>
-    </w:p>
-    <w:p>
-      <w:pPr>
-        <w:pStyle w:val="ListBullet"/>
-      </w:pPr>
-      <w:r>
-        <w:rPr>
-          <w:rFonts w:ascii="Arial" w:hAnsi="Arial"/>
-          <w:sz w:val="19"/>
-        </w:rPr>
-        <w:t>Supervisor or administrator verification</w:t>
-      </w:r>
-    </w:p>
-    <w:p>
-      <w:pPr>
-        <w:pStyle w:val="ListBullet"/>
-      </w:pPr>
-      <w:r>
-        <w:rPr>
-          <w:rFonts w:ascii="Arial" w:hAnsi="Arial"/>
-          <w:sz w:val="19"/>
-        </w:rPr>
-        <w:t>Evidence or notes</w:t>
-      </w:r>
-    </w:p>
-    <w:p>
-      <w:pPr>
-        <w:pStyle w:val="Heading3"/>
-      </w:pPr>
-      <w:r>
-        <w:t>Follow-up and support</w:t>
-      </w:r>
-    </w:p>
-    <w:p>
-      <w:pPr>
-        <w:pStyle w:val="ListBullet"/>
-      </w:pPr>
-      <w:r>
-        <w:rPr>
-          <w:rFonts w:ascii="Arial" w:hAnsi="Arial"/>
-          <w:sz w:val="19"/>
-        </w:rPr>
-        <w:t>Staff groups needing additional support</w:t>
-      </w:r>
-    </w:p>
-    <w:p>
-      <w:pPr>
-        <w:pStyle w:val="ListBullet"/>
-      </w:pPr>
-      <w:r>
-        <w:rPr>
-          <w:rFonts w:ascii="Arial" w:hAnsi="Arial"/>
-          <w:sz w:val="19"/>
-        </w:rPr>
-        <w:t>Office hours or coaching schedule</w:t>
-      </w:r>
-    </w:p>
-    <w:p>
-      <w:pPr>
-        <w:pStyle w:val="ListBullet"/>
-      </w:pPr>
-      <w:r>
-        <w:rPr>
-          <w:rFonts w:ascii="Arial" w:hAnsi="Arial"/>
-          <w:sz w:val="19"/>
-        </w:rPr>
-        <w:t>Champion or mentor assigned</w:t>
-      </w:r>
-    </w:p>
-    <w:p>
-      <w:pPr>
-        <w:pStyle w:val="ListBullet"/>
-      </w:pPr>
-      <w:r>
-        <w:rPr>
-          <w:rFonts w:ascii="Arial" w:hAnsi="Arial"/>
-          <w:sz w:val="19"/>
-        </w:rPr>
-        <w:t>Refresher training needs</w:t>
-      </w:r>
-    </w:p>
-    <w:p>
-      <w:pPr>
-        <w:pStyle w:val="ListBullet"/>
-      </w:pPr>
-      <w:r>
-        <w:rPr>
-          <w:rFonts w:ascii="Arial" w:hAnsi="Arial"/>
-          <w:sz w:val="19"/>
-        </w:rPr>
-        <w:t>Escalation or governance issues</w:t>
       </w:r>
     </w:p>
     <w:p>

</xml_diff>